<commit_message>
Agrega verificacion estructural del pseudocodigo yfigures por partes
PSeInt es una aplicacion de escritorio y no se puede ejecutar de forma
automatizada, por lo que no habia forma de comprobar el algoritmo antes
de digitarlo. tests/validar_pseint.py analiza el pseudocodigo y verifica
balance de bloques, declaracion previa de arreglos, rango de indices y
declaracion de variables leidas. El verificador se probo contra siete
mutaciones del algoritmo para confirmar que detecta los errores.

Las trazas de consola se dividen en varias figuras para que ninguna
desborde el alto util de la hoja, y el generador publica un manifiesto
que consume el generador del documento, de modo que figuras y epigrafes
no se desalineen.
</commit_message>
<xml_diff>
--- a/docs/diaz_luis_taller.docx
+++ b/docs/diaz_luis_taller.docx
@@ -9796,6 +9796,20 @@
       <w:r>
         <w:rPr>
           <w:b w:val="0"/>
+          <w:i w:val="0"/>
+          <w:sz w:val="22"/>
+        </w:rPr>
+        <w:t>El archivo tests/validar_pseint.py realiza además una verificación estructural del pseudocódigo de PSeInt por análisis estático: confirma que cada bloque abierto tenga su cierre, que todo arreglo esté declarado antes de usarse, que los índices permanezcan dentro del rango declarado y que toda variable leída haya sido declarada. Esto sustituye la comprobación manual previa a digitar el algoritmo en el intérprete.</w:t>
+      </w:r>
+    </w:p>
+    <w:p>
+      <w:pPr>
+        <w:spacing w:before="0" w:after="120" w:line="360" w:lineRule="auto"/>
+        <w:jc w:val="both"/>
+      </w:pPr>
+      <w:r>
+        <w:rPr>
+          <w:b w:val="0"/>
           <w:i/>
           <w:sz w:val="20"/>
         </w:rPr>
@@ -10371,6 +10385,20 @@
           <w:i w:val="0"/>
           <w:sz w:val="22"/>
         </w:rPr>
+        <w:t>Además, el pseudocódigo se sometió a una verificación estructural por análisis estático que confirma el balance de bloques, la declaración previa de los arreglos, el rango de los índices y la declaración de las variables leídas.</w:t>
+      </w:r>
+    </w:p>
+    <w:p>
+      <w:pPr>
+        <w:spacing w:before="0" w:after="120" w:line="360" w:lineRule="auto"/>
+        <w:jc w:val="both"/>
+      </w:pPr>
+      <w:r>
+        <w:rPr>
+          <w:b w:val="0"/>
+          <w:i w:val="0"/>
+          <w:sz w:val="22"/>
+        </w:rPr>
         <w:t>Los resultados obtenidos con la traza de la figura 1 se contrastan a continuación con el cálculo manual, para demostrar que la lógica del algoritmo es correcta y no solamente que el programa termina sin error.</w:t>
       </w:r>
     </w:p>
@@ -11630,7 +11658,7 @@
               <w:rPr>
                 <w:sz w:val="19"/>
               </w:rPr>
-              <w:t>evidencias/generar_evidencias.py</w:t>
+              <w:t>tests/validar_pseint.py</w:t>
             </w:r>
           </w:p>
         </w:tc>
@@ -11648,7 +11676,7 @@
               <w:rPr>
                 <w:sz w:val="19"/>
               </w:rPr>
-              <w:t>Generador de las figuras de consola</w:t>
+              <w:t>Verificación estructural del pseudocódigo</w:t>
             </w:r>
           </w:p>
         </w:tc>
@@ -11667,7 +11695,7 @@
               <w:rPr>
                 <w:sz w:val="19"/>
               </w:rPr>
-              <w:t>evidencias/consola/</w:t>
+              <w:t>evidencias/generar_evidencias.py</w:t>
             </w:r>
           </w:p>
         </w:tc>
@@ -11684,7 +11712,7 @@
               <w:rPr>
                 <w:sz w:val="19"/>
               </w:rPr>
-              <w:t>Imágenes de salida de ejecución</w:t>
+              <w:t>Generador de las figuras de consola</w:t>
             </w:r>
           </w:p>
         </w:tc>
@@ -11704,7 +11732,7 @@
               <w:rPr>
                 <w:sz w:val="19"/>
               </w:rPr>
-              <w:t>evidencias/paso_a_paso/CUADRILLA_DE_CAPTURAS.md</w:t>
+              <w:t>evidencias/consola/</w:t>
             </w:r>
           </w:p>
         </w:tc>
@@ -11712,6 +11740,42 @@
           <w:tcPr>
             <w:tcW w:type="dxa" w:w="5159"/>
             <w:shd w:val="clear" w:color="auto" w:fill="F4F7FB"/>
+          </w:tcPr>
+          <w:p>
+            <w:pPr>
+              <w:spacing w:before="40" w:after="40" w:line="240" w:lineRule="auto"/>
+              <w:jc w:val="left"/>
+            </w:pPr>
+            <w:r>
+              <w:rPr>
+                <w:sz w:val="19"/>
+              </w:rPr>
+              <w:t>Imágenes de salida de ejecución</w:t>
+            </w:r>
+          </w:p>
+        </w:tc>
+      </w:tr>
+      <w:tr>
+        <w:tc>
+          <w:tcPr>
+            <w:tcW w:type="dxa" w:w="4195"/>
+          </w:tcPr>
+          <w:p>
+            <w:pPr>
+              <w:spacing w:before="40" w:after="40" w:line="240" w:lineRule="auto"/>
+              <w:jc w:val="center"/>
+            </w:pPr>
+            <w:r>
+              <w:rPr>
+                <w:sz w:val="19"/>
+              </w:rPr>
+              <w:t>evidencias/paso_a_paso/CUADRILLA_DE_CAPTURAS.md</w:t>
+            </w:r>
+          </w:p>
+        </w:tc>
+        <w:tc>
+          <w:tcPr>
+            <w:tcW w:type="dxa" w:w="5159"/>
           </w:tcPr>
           <w:p>
             <w:pPr>

</xml_diff>